<commit_message>
some tiny revisions were done
</commit_message>
<xml_diff>
--- a/Assessing-the-Impacts-of-Damming-and-Drought-on-Discharge-Variability-in-the-Tigris–Euphrates.docx
+++ b/Assessing-the-Impacts-of-Damming-and-Drought-on-Discharge-Variability-in-the-Tigris–Euphrates.docx
@@ -10705,8 +10705,8 @@
         <w:tblLook w:val="04A0" w:firstRow="1" w:lastRow="0" w:firstColumn="1" w:lastColumn="0" w:noHBand="0" w:noVBand="1"/>
       </w:tblPr>
       <w:tblGrid>
-        <w:gridCol w:w="4839"/>
-        <w:gridCol w:w="4521"/>
+        <w:gridCol w:w="4591"/>
+        <w:gridCol w:w="4769"/>
       </w:tblGrid>
       <w:tr>
         <w:trPr>
@@ -10725,16 +10725,14 @@
             </w:pPr>
             <w:r>
               <w:rPr>
-                <w:rFonts w:asciiTheme="majorBidi" w:hAnsiTheme="majorBidi" w:cstheme="majorBidi"/>
                 <w:noProof/>
-                <w:lang w:val="en-US"/>
               </w:rPr>
               <w:lastRenderedPageBreak/>
               <w:drawing>
-                <wp:inline distT="0" distB="0" distL="0" distR="0" wp14:anchorId="1B88B7A3" wp14:editId="2CB13909">
-                  <wp:extent cx="3014691" cy="1741336"/>
-                  <wp:effectExtent l="0" t="0" r="0" b="0"/>
-                  <wp:docPr id="700716486" name="Picture 1"/>
+                <wp:inline distT="0" distB="0" distL="0" distR="0" wp14:anchorId="7BC560B7" wp14:editId="0C233E9E">
+                  <wp:extent cx="2358957" cy="1362953"/>
+                  <wp:effectExtent l="0" t="0" r="3810" b="8890"/>
+                  <wp:docPr id="151379291" name="Picture 2"/>
                   <wp:cNvGraphicFramePr>
                     <a:graphicFrameLocks xmlns:a="http://schemas.openxmlformats.org/drawingml/2006/main" noChangeAspect="1"/>
                   </wp:cNvGraphicFramePr>
@@ -10742,19 +10740,20 @@
                     <a:graphicData uri="http://schemas.openxmlformats.org/drawingml/2006/picture">
                       <pic:pic xmlns:pic="http://schemas.openxmlformats.org/drawingml/2006/picture">
                         <pic:nvPicPr>
-                          <pic:cNvPr id="700716486" name="Picture 1"/>
+                          <pic:cNvPr id="0" name="Picture 3"/>
                           <pic:cNvPicPr>
                             <a:picLocks noChangeAspect="1" noChangeArrowheads="1"/>
                           </pic:cNvPicPr>
                         </pic:nvPicPr>
                         <pic:blipFill>
-                          <a:blip r:embed="rId36" cstate="screen">
+                          <a:blip r:embed="rId36" cstate="print">
                             <a:extLst>
                               <a:ext uri="{28A0092B-C50C-407E-A947-70E740481C1C}">
-                                <a14:useLocalDpi xmlns:a14="http://schemas.microsoft.com/office/drawing/2010/main"/>
+                                <a14:useLocalDpi xmlns:a14="http://schemas.microsoft.com/office/drawing/2010/main" val="0"/>
                               </a:ext>
                             </a:extLst>
                           </a:blip>
+                          <a:srcRect/>
                           <a:stretch>
                             <a:fillRect/>
                           </a:stretch>
@@ -10762,7 +10761,7 @@
                         <pic:spPr bwMode="auto">
                           <a:xfrm>
                             <a:off x="0" y="0"/>
-                            <a:ext cx="3030675" cy="1750569"/>
+                            <a:ext cx="2388396" cy="1379962"/>
                           </a:xfrm>
                           <a:prstGeom prst="rect">
                             <a:avLst/>
@@ -10771,11 +10770,6 @@
                           <a:ln>
                             <a:noFill/>
                           </a:ln>
-                          <a:extLst>
-                            <a:ext uri="{53640926-AAD7-44D8-BBD7-CCE9431645EC}">
-                              <a14:shadowObscured xmlns:a14="http://schemas.microsoft.com/office/drawing/2010/main"/>
-                            </a:ext>
-                          </a:extLst>
                         </pic:spPr>
                       </pic:pic>
                     </a:graphicData>
@@ -11673,14 +11667,7 @@
         <w:rPr>
           <w:rFonts w:asciiTheme="majorBidi" w:hAnsiTheme="majorBidi" w:cstheme="majorBidi"/>
         </w:rPr>
-        <w:t xml:space="preserve">(over 100 m³/s compared to about 20 m³/s), </w:t>
-      </w:r>
-      <w:r>
-        <w:rPr>
-          <w:rFonts w:asciiTheme="majorBidi" w:hAnsiTheme="majorBidi" w:cstheme="majorBidi"/>
-        </w:rPr>
-        <w:lastRenderedPageBreak/>
-        <w:t xml:space="preserve">which are less affected by meteorological drought. </w:t>
+        <w:t xml:space="preserve">(over 100 m³/s compared to about 20 m³/s), which are less affected by meteorological drought. </w:t>
       </w:r>
       <w:r>
         <w:rPr>
@@ -11776,6 +11763,7 @@
           <w:sz w:val="24"/>
           <w:szCs w:val="24"/>
         </w:rPr>
+        <w:lastRenderedPageBreak/>
         <w:drawing>
           <wp:inline distT="0" distB="0" distL="0" distR="0" wp14:anchorId="3A536683" wp14:editId="33998564">
             <wp:extent cx="4715757" cy="2126121"/>
@@ -12102,89 +12090,89 @@
           <w:rFonts w:asciiTheme="majorBidi" w:hAnsiTheme="majorBidi" w:cstheme="majorBidi"/>
           <w:b/>
         </w:rPr>
+        <w:t xml:space="preserve">Varying </w:t>
+      </w:r>
+      <w:r>
+        <w:rPr>
+          <w:rFonts w:asciiTheme="majorBidi" w:hAnsiTheme="majorBidi" w:cstheme="majorBidi"/>
+          <w:b/>
+        </w:rPr>
+        <w:t xml:space="preserve">impact </w:t>
+      </w:r>
+      <w:r>
+        <w:rPr>
+          <w:rFonts w:asciiTheme="majorBidi" w:hAnsiTheme="majorBidi" w:cstheme="majorBidi"/>
+          <w:b/>
+        </w:rPr>
+        <w:t xml:space="preserve">of </w:t>
+      </w:r>
+      <w:r>
+        <w:rPr>
+          <w:rFonts w:asciiTheme="majorBidi" w:hAnsiTheme="majorBidi" w:cstheme="majorBidi"/>
+          <w:b/>
+        </w:rPr>
+        <w:t>drought</w:t>
+      </w:r>
+      <w:r>
+        <w:rPr>
+          <w:rFonts w:asciiTheme="majorBidi" w:hAnsiTheme="majorBidi" w:cstheme="majorBidi"/>
+          <w:b/>
+        </w:rPr>
+        <w:t>:</w:t>
+      </w:r>
+      <w:r>
+        <w:rPr>
+          <w:rFonts w:asciiTheme="majorBidi" w:hAnsiTheme="majorBidi" w:cstheme="majorBidi"/>
+        </w:rPr>
+        <w:t xml:space="preserve"> </w:t>
+      </w:r>
+      <w:r>
+        <w:rPr>
+          <w:rFonts w:asciiTheme="majorBidi" w:hAnsiTheme="majorBidi" w:cstheme="majorBidi"/>
+        </w:rPr>
+        <w:t xml:space="preserve">River discharge showed a strong positive correlation with PDSI at both proximal and distal </w:t>
+      </w:r>
+      <w:r>
+        <w:rPr>
+          <w:rFonts w:asciiTheme="majorBidi" w:hAnsiTheme="majorBidi" w:cstheme="majorBidi"/>
+        </w:rPr>
+        <w:t>point</w:t>
+      </w:r>
+      <w:r>
+        <w:rPr>
+          <w:rFonts w:asciiTheme="majorBidi" w:hAnsiTheme="majorBidi" w:cstheme="majorBidi"/>
+        </w:rPr>
+        <w:t xml:space="preserve">s. The correlation was higher at distal </w:t>
+      </w:r>
+      <w:r>
+        <w:rPr>
+          <w:rFonts w:asciiTheme="majorBidi" w:hAnsiTheme="majorBidi" w:cstheme="majorBidi"/>
+        </w:rPr>
+        <w:t>point</w:t>
+      </w:r>
+      <w:r>
+        <w:rPr>
+          <w:rFonts w:asciiTheme="majorBidi" w:hAnsiTheme="majorBidi" w:cstheme="majorBidi"/>
+        </w:rPr>
+        <w:t xml:space="preserve">s and at proximal </w:t>
+      </w:r>
+      <w:r>
+        <w:rPr>
+          <w:rFonts w:asciiTheme="majorBidi" w:hAnsiTheme="majorBidi" w:cstheme="majorBidi"/>
+        </w:rPr>
+        <w:t>ones</w:t>
+      </w:r>
+      <w:r>
+        <w:rPr>
+          <w:rFonts w:asciiTheme="majorBidi" w:hAnsiTheme="majorBidi" w:cstheme="majorBidi"/>
+        </w:rPr>
+        <w:t xml:space="preserve"> after dam construction, indicating stronger drought influence linked to climatic and damming effects. Near-dam </w:t>
+      </w:r>
+      <w:r>
+        <w:rPr>
+          <w:rFonts w:asciiTheme="majorBidi" w:hAnsiTheme="majorBidi" w:cstheme="majorBidi"/>
+        </w:rPr>
         <w:lastRenderedPageBreak/>
-        <w:t xml:space="preserve">Varying </w:t>
-      </w:r>
-      <w:r>
-        <w:rPr>
-          <w:rFonts w:asciiTheme="majorBidi" w:hAnsiTheme="majorBidi" w:cstheme="majorBidi"/>
-          <w:b/>
-        </w:rPr>
-        <w:t xml:space="preserve">impact </w:t>
-      </w:r>
-      <w:r>
-        <w:rPr>
-          <w:rFonts w:asciiTheme="majorBidi" w:hAnsiTheme="majorBidi" w:cstheme="majorBidi"/>
-          <w:b/>
-        </w:rPr>
-        <w:t xml:space="preserve">of </w:t>
-      </w:r>
-      <w:r>
-        <w:rPr>
-          <w:rFonts w:asciiTheme="majorBidi" w:hAnsiTheme="majorBidi" w:cstheme="majorBidi"/>
-          <w:b/>
-        </w:rPr>
-        <w:t>drought</w:t>
-      </w:r>
-      <w:r>
-        <w:rPr>
-          <w:rFonts w:asciiTheme="majorBidi" w:hAnsiTheme="majorBidi" w:cstheme="majorBidi"/>
-          <w:b/>
-        </w:rPr>
-        <w:t>:</w:t>
-      </w:r>
-      <w:r>
-        <w:rPr>
-          <w:rFonts w:asciiTheme="majorBidi" w:hAnsiTheme="majorBidi" w:cstheme="majorBidi"/>
-        </w:rPr>
-        <w:t xml:space="preserve"> </w:t>
-      </w:r>
-      <w:r>
-        <w:rPr>
-          <w:rFonts w:asciiTheme="majorBidi" w:hAnsiTheme="majorBidi" w:cstheme="majorBidi"/>
-        </w:rPr>
-        <w:t xml:space="preserve">River discharge showed a strong positive correlation with PDSI at both proximal and distal </w:t>
-      </w:r>
-      <w:r>
-        <w:rPr>
-          <w:rFonts w:asciiTheme="majorBidi" w:hAnsiTheme="majorBidi" w:cstheme="majorBidi"/>
-        </w:rPr>
-        <w:t>point</w:t>
-      </w:r>
-      <w:r>
-        <w:rPr>
-          <w:rFonts w:asciiTheme="majorBidi" w:hAnsiTheme="majorBidi" w:cstheme="majorBidi"/>
-        </w:rPr>
-        <w:t xml:space="preserve">s. The correlation was higher at distal </w:t>
-      </w:r>
-      <w:r>
-        <w:rPr>
-          <w:rFonts w:asciiTheme="majorBidi" w:hAnsiTheme="majorBidi" w:cstheme="majorBidi"/>
-        </w:rPr>
-        <w:t>point</w:t>
-      </w:r>
-      <w:r>
-        <w:rPr>
-          <w:rFonts w:asciiTheme="majorBidi" w:hAnsiTheme="majorBidi" w:cstheme="majorBidi"/>
-        </w:rPr>
-        <w:t xml:space="preserve">s and at proximal </w:t>
-      </w:r>
-      <w:r>
-        <w:rPr>
-          <w:rFonts w:asciiTheme="majorBidi" w:hAnsiTheme="majorBidi" w:cstheme="majorBidi"/>
-        </w:rPr>
-        <w:t>ones</w:t>
-      </w:r>
-      <w:r>
-        <w:rPr>
-          <w:rFonts w:asciiTheme="majorBidi" w:hAnsiTheme="majorBidi" w:cstheme="majorBidi"/>
-        </w:rPr>
-        <w:t xml:space="preserve"> after dam construction, indicating stronger drought influence linked to climatic and damming effects. Near-dam </w:t>
-      </w:r>
-      <w:r>
-        <w:rPr>
-          <w:rFonts w:asciiTheme="majorBidi" w:hAnsiTheme="majorBidi" w:cstheme="majorBidi"/>
-        </w:rPr>
         <w:t>point</w:t>
       </w:r>
       <w:r>
@@ -12480,64 +12468,72 @@
       <w:pPr>
         <w:pStyle w:val="a"/>
         <w:rPr>
-          <w:rFonts w:asciiTheme="majorBidi" w:hAnsiTheme="majorBidi" w:cstheme="majorBidi"/>
-        </w:rPr>
-      </w:pPr>
+          <w:rFonts w:asciiTheme="majorBidi" w:hAnsiTheme="majorBidi" w:cstheme="majorBidi" w:hint="cs"/>
+          <w:rtl/>
+          <w:lang w:bidi="fa-IR"/>
+        </w:rPr>
+      </w:pPr>
+      <w:r>
+        <w:rPr>
+          <w:rFonts w:asciiTheme="majorBidi" w:hAnsiTheme="majorBidi" w:cstheme="majorBidi"/>
+        </w:rPr>
+        <w:t xml:space="preserve">Pairwise correlation analysis between </w:t>
+      </w:r>
+      <w:r>
+        <w:rPr>
+          <w:rFonts w:asciiTheme="majorBidi" w:hAnsiTheme="majorBidi" w:cstheme="majorBidi"/>
+        </w:rPr>
+        <w:t>points</w:t>
+      </w:r>
+      <w:r>
+        <w:rPr>
+          <w:rFonts w:asciiTheme="majorBidi" w:hAnsiTheme="majorBidi" w:cstheme="majorBidi"/>
+        </w:rPr>
+        <w:t xml:space="preserve"> near and far from dams over the study period (1979–2022) revealed generally similar </w:t>
+      </w:r>
+      <w:r>
+        <w:rPr>
+          <w:rFonts w:asciiTheme="majorBidi" w:hAnsiTheme="majorBidi" w:cstheme="majorBidi"/>
+        </w:rPr>
+        <w:t>behaviour</w:t>
+      </w:r>
+      <w:r>
+        <w:rPr>
+          <w:rFonts w:asciiTheme="majorBidi" w:hAnsiTheme="majorBidi" w:cstheme="majorBidi"/>
+        </w:rPr>
+        <w:t xml:space="preserve"> for both groups (Fig. 9). Detailed daily, monthly, seasonal, and annual discharge trends are provided in the Appendix</w:t>
+      </w:r>
+      <w:r>
+        <w:rPr>
+          <w:rFonts w:asciiTheme="majorBidi" w:hAnsiTheme="majorBidi" w:cstheme="majorBidi"/>
+        </w:rPr>
+        <w:t xml:space="preserve"> (see Appendix Extended </w:t>
+      </w:r>
+      <w:r>
+        <w:rPr>
+          <w:rFonts w:asciiTheme="majorBidi" w:hAnsiTheme="majorBidi" w:cstheme="majorBidi"/>
+          <w:lang w:val="en-US"/>
+        </w:rPr>
+        <w:t>Figs. 1–8</w:t>
+      </w:r>
+      <w:r>
+        <w:rPr>
+          <w:rFonts w:asciiTheme="majorBidi" w:hAnsiTheme="majorBidi" w:cstheme="majorBidi"/>
+        </w:rPr>
+        <w:t>)</w:t>
+      </w:r>
+      <w:r>
+        <w:rPr>
+          <w:rFonts w:asciiTheme="majorBidi" w:hAnsiTheme="majorBidi" w:cstheme="majorBidi"/>
+        </w:rPr>
+        <w:t xml:space="preserve">. Correlations were </w:t>
+      </w:r>
       <w:r>
         <w:rPr>
           <w:rFonts w:asciiTheme="majorBidi" w:hAnsiTheme="majorBidi" w:cstheme="majorBidi"/>
         </w:rPr>
         <w:lastRenderedPageBreak/>
-        <w:t xml:space="preserve">Pairwise correlation analysis between </w:t>
-      </w:r>
-      <w:r>
-        <w:rPr>
-          <w:rFonts w:asciiTheme="majorBidi" w:hAnsiTheme="majorBidi" w:cstheme="majorBidi"/>
-        </w:rPr>
-        <w:t>points</w:t>
-      </w:r>
-      <w:r>
-        <w:rPr>
-          <w:rFonts w:asciiTheme="majorBidi" w:hAnsiTheme="majorBidi" w:cstheme="majorBidi"/>
-        </w:rPr>
-        <w:t xml:space="preserve"> near and far from dams over the study period (1979–2022) revealed generally similar </w:t>
-      </w:r>
-      <w:r>
-        <w:rPr>
-          <w:rFonts w:asciiTheme="majorBidi" w:hAnsiTheme="majorBidi" w:cstheme="majorBidi"/>
-        </w:rPr>
-        <w:t>behaviour</w:t>
-      </w:r>
-      <w:r>
-        <w:rPr>
-          <w:rFonts w:asciiTheme="majorBidi" w:hAnsiTheme="majorBidi" w:cstheme="majorBidi"/>
-        </w:rPr>
-        <w:t xml:space="preserve"> for both groups (Fig. 9). Detailed daily, monthly, seasonal, and annual discharge trends are provided in the Appendix</w:t>
-      </w:r>
-      <w:r>
-        <w:rPr>
-          <w:rFonts w:asciiTheme="majorBidi" w:hAnsiTheme="majorBidi" w:cstheme="majorBidi"/>
-        </w:rPr>
-        <w:t xml:space="preserve"> (see Appendix Extended </w:t>
-      </w:r>
-      <w:r>
-        <w:rPr>
-          <w:rFonts w:asciiTheme="majorBidi" w:hAnsiTheme="majorBidi" w:cstheme="majorBidi"/>
-          <w:lang w:val="en-US"/>
-        </w:rPr>
-        <w:t>Figs. 1–8</w:t>
-      </w:r>
-      <w:r>
-        <w:rPr>
-          <w:rFonts w:asciiTheme="majorBidi" w:hAnsiTheme="majorBidi" w:cstheme="majorBidi"/>
-        </w:rPr>
-        <w:t>)</w:t>
-      </w:r>
-      <w:r>
-        <w:rPr>
-          <w:rFonts w:asciiTheme="majorBidi" w:hAnsiTheme="majorBidi" w:cstheme="majorBidi"/>
-        </w:rPr>
-        <w:t>. Correlations were calculated using the Pearson coefficient to assess the influence of damming and drought on discharge variability.</w:t>
+        <w:t>calculated using the Pearson coefficient to assess the influence of damming and drought on discharge variability.</w:t>
       </w:r>
     </w:p>
     <w:tbl>
@@ -12555,8 +12551,8 @@
         <w:tblLook w:val="04A0" w:firstRow="1" w:lastRow="0" w:firstColumn="1" w:lastColumn="0" w:noHBand="0" w:noVBand="1"/>
       </w:tblPr>
       <w:tblGrid>
-        <w:gridCol w:w="4875"/>
-        <w:gridCol w:w="4485"/>
+        <w:gridCol w:w="4853"/>
+        <w:gridCol w:w="4507"/>
       </w:tblGrid>
       <w:tr>
         <w:tc>
@@ -12586,9 +12582,9 @@
                 <w:szCs w:val="24"/>
               </w:rPr>
               <w:drawing>
-                <wp:inline distT="0" distB="0" distL="0" distR="0" wp14:anchorId="5E49CBE7" wp14:editId="386B6127">
+                <wp:inline distT="0" distB="0" distL="0" distR="0" wp14:anchorId="5E49CBE7" wp14:editId="7B0A9AC0">
                   <wp:extent cx="2994327" cy="1353869"/>
-                  <wp:effectExtent l="0" t="0" r="0" b="0"/>
+                  <wp:effectExtent l="0" t="0" r="0" b="635"/>
                   <wp:docPr id="1" name="Picture 1"/>
                   <wp:cNvGraphicFramePr>
                     <a:graphicFrameLocks xmlns:a="http://schemas.openxmlformats.org/drawingml/2006/main" noChangeAspect="1"/>
@@ -12614,7 +12610,7 @@
                         <pic:spPr bwMode="auto">
                           <a:xfrm>
                             <a:off x="0" y="0"/>
-                            <a:ext cx="3005802" cy="1359057"/>
+                            <a:ext cx="2994327" cy="1353869"/>
                           </a:xfrm>
                           <a:prstGeom prst="rect">
                             <a:avLst/>
@@ -12655,18 +12651,13 @@
             </w:pPr>
             <w:r>
               <w:rPr>
-                <w:rFonts w:asciiTheme="majorBidi" w:eastAsia="Google Sans Text" w:hAnsiTheme="majorBidi" w:cstheme="majorBidi"/>
-                <w:b/>
                 <w:noProof/>
-                <w:color w:val="1B1C1D"/>
-                <w:sz w:val="24"/>
-                <w:szCs w:val="24"/>
               </w:rPr>
               <w:drawing>
-                <wp:inline distT="0" distB="0" distL="0" distR="0" wp14:anchorId="7F295EE9" wp14:editId="712B1C75">
-                  <wp:extent cx="2743200" cy="1415756"/>
-                  <wp:effectExtent l="0" t="0" r="0" b="0"/>
-                  <wp:docPr id="2" name="Picture 2"/>
+                <wp:inline distT="0" distB="0" distL="0" distR="0" wp14:anchorId="0FCF6C0C" wp14:editId="10EB3D0E">
+                  <wp:extent cx="2771139" cy="1369263"/>
+                  <wp:effectExtent l="0" t="0" r="0" b="2540"/>
+                  <wp:docPr id="1670208565" name="Picture 1"/>
                   <wp:cNvGraphicFramePr>
                     <a:graphicFrameLocks xmlns:a="http://schemas.openxmlformats.org/drawingml/2006/main" noChangeAspect="1"/>
                   </wp:cNvGraphicFramePr>
@@ -12674,28 +12665,31 @@
                     <a:graphicData uri="http://schemas.openxmlformats.org/drawingml/2006/picture">
                       <pic:pic xmlns:pic="http://schemas.openxmlformats.org/drawingml/2006/picture">
                         <pic:nvPicPr>
-                          <pic:cNvPr id="1089826753" name="Picture 1089826753"/>
-                          <pic:cNvPicPr/>
+                          <pic:cNvPr id="0" name="Picture 1"/>
+                          <pic:cNvPicPr>
+                            <a:picLocks noChangeAspect="1" noChangeArrowheads="1"/>
+                          </pic:cNvPicPr>
                         </pic:nvPicPr>
                         <pic:blipFill rotWithShape="1">
                           <a:blip r:embed="rId41" cstate="print">
                             <a:extLst>
                               <a:ext uri="{28A0092B-C50C-407E-A947-70E740481C1C}">
-                                <a14:useLocalDpi xmlns:a14="http://schemas.microsoft.com/office/drawing/2010/main"/>
+                                <a14:useLocalDpi xmlns:a14="http://schemas.microsoft.com/office/drawing/2010/main" val="0"/>
                               </a:ext>
                             </a:extLst>
                           </a:blip>
-                          <a:srcRect l="10106" t="4875"/>
+                          <a:srcRect l="6187" t="4936"/>
                           <a:stretch/>
                         </pic:blipFill>
                         <pic:spPr bwMode="auto">
                           <a:xfrm>
                             <a:off x="0" y="0"/>
-                            <a:ext cx="2743200" cy="1415756"/>
+                            <a:ext cx="2822473" cy="1394628"/>
                           </a:xfrm>
                           <a:prstGeom prst="rect">
                             <a:avLst/>
                           </a:prstGeom>
+                          <a:noFill/>
                           <a:ln>
                             <a:noFill/>
                           </a:ln>

</xml_diff>